<commit_message>
Digital Skills Lecture 4 built around a worksheet: four experiments in Word on a plain notice
The worksheet gives every student book-fair-start.docx, a notice of a library
book fair with no formatting, and books.png, a drawing of books on a shelf.
Four experiments: Bold on one word and Center on one line show text and
paragraph formatting, then line spacing 1.5; Title and Heading 1, the
Navigation Pane with four headings and Heading 1 modified once; bullets or
numbers, a price table with a header row (2 columns, 4 rows) and Tab in the
last cell; a picture in line, resized from a corner and a side, Square
wrapping and alt text. The Family Day notice stays the Game challenge, so the
worksheet does not give its answers. The page shows the experiments with a
check after every step; the notes point to them; the slides demonstrate them
(16 slides). The Word start files now carry the styles of a new document, so
Title and the headings look the same in every version of Word.
</commit_message>
<xml_diff>
--- a/courses/digital-skills/week-03/files/notice-start.docx
+++ b/courses/digital-skills/week-03/files/notice-start.docx
@@ -46,4 +46,115 @@
     </w:sectPr>
   </w:body>
 </w:document>
+</file>
+
+<file path=word/styles.xml><?xml version="1.0" encoding="utf-8"?>
+<w:styles xmlns:w="http://schemas.openxmlformats.org/wordprocessingml/2006/main">
+  <w:docDefaults>
+    <w:rPrDefault>
+      <w:rPr>
+        <w:rFonts w:ascii="Calibri" w:hAnsi="Calibri" w:eastAsia="Calibri" w:cs="Arial"/>
+        <w:sz w:val="22"/>
+        <w:szCs w:val="22"/>
+        <w:lang w:val="en-US"/>
+      </w:rPr>
+    </w:rPrDefault>
+    <w:pPrDefault>
+      <w:pPr>
+        <w:spacing w:after="120" w:line="240" w:lineRule="auto"/>
+      </w:pPr>
+    </w:pPrDefault>
+  </w:docDefaults>
+  <w:style w:type="paragraph" w:default="1" w:styleId="Normal">
+    <w:name w:val="Normal"/>
+    <w:qFormat/>
+  </w:style>
+  <w:style w:type="paragraph" w:styleId="Title">
+    <w:name w:val="Title"/>
+    <w:basedOn w:val="Normal"/>
+    <w:next w:val="Normal"/>
+    <w:uiPriority w:val="10"/>
+    <w:qFormat/>
+    <w:pPr>
+      <w:spacing w:after="160"/>
+      <w:contextualSpacing/>
+    </w:pPr>
+    <w:rPr>
+      <w:rFonts w:ascii="Calibri Light" w:hAnsi="Calibri Light"/>
+      <w:spacing w:val="-10"/>
+      <w:kern w:val="28"/>
+      <w:sz w:val="56"/>
+      <w:szCs w:val="56"/>
+    </w:rPr>
+  </w:style>
+  <w:style w:type="paragraph" w:styleId="Heading1">
+    <w:name w:val="heading 1"/>
+    <w:basedOn w:val="Normal"/>
+    <w:next w:val="Normal"/>
+    <w:uiPriority w:val="9"/>
+    <w:qFormat/>
+    <w:pPr>
+      <w:keepNext/>
+      <w:keepLines/>
+      <w:spacing w:before="240" w:after="60"/>
+      <w:outlineLvl w:val="0"/>
+    </w:pPr>
+    <w:rPr>
+      <w:rFonts w:ascii="Calibri Light" w:hAnsi="Calibri Light"/>
+      <w:color w:val="2F5496"/>
+      <w:sz w:val="32"/>
+      <w:szCs w:val="32"/>
+    </w:rPr>
+  </w:style>
+  <w:style w:type="paragraph" w:styleId="Heading2">
+    <w:name w:val="heading 2"/>
+    <w:basedOn w:val="Normal"/>
+    <w:next w:val="Normal"/>
+    <w:uiPriority w:val="9"/>
+    <w:qFormat/>
+    <w:pPr>
+      <w:keepNext/>
+      <w:keepLines/>
+      <w:spacing w:before="160" w:after="40"/>
+      <w:outlineLvl w:val="1"/>
+    </w:pPr>
+    <w:rPr>
+      <w:rFonts w:ascii="Calibri Light" w:hAnsi="Calibri Light"/>
+      <w:color w:val="2F5496"/>
+      <w:sz w:val="26"/>
+      <w:szCs w:val="26"/>
+    </w:rPr>
+  </w:style>
+  <w:style w:type="paragraph" w:styleId="ListParagraph">
+    <w:name w:val="List Paragraph"/>
+    <w:basedOn w:val="Normal"/>
+    <w:uiPriority w:val="34"/>
+    <w:qFormat/>
+    <w:pPr>
+      <w:ind w:left="720"/>
+      <w:contextualSpacing/>
+    </w:pPr>
+  </w:style>
+  <w:style w:type="character" w:default="1" w:styleId="DefaultParagraphFont">
+    <w:name w:val="Default Paragraph Font"/>
+    <w:uiPriority w:val="1"/>
+    <w:semiHidden/>
+    <w:unhideWhenUsed/>
+  </w:style>
+  <w:style w:type="table" w:default="1" w:styleId="TableNormal">
+    <w:name w:val="Normal Table"/>
+    <w:uiPriority w:val="99"/>
+    <w:semiHidden/>
+    <w:unhideWhenUsed/>
+    <w:tblPr>
+      <w:tblInd w:w="0" w:type="dxa"/>
+      <w:tblCellMar>
+        <w:top w:w="0" w:type="dxa"/>
+        <w:left w:w="108" w:type="dxa"/>
+        <w:bottom w:w="0" w:type="dxa"/>
+        <w:right w:w="108" w:type="dxa"/>
+      </w:tblCellMar>
+    </w:tblPr>
+  </w:style>
+</w:styles>
 </file>
</xml_diff>